<commit_message>
Update VRSTE KREDITOV IN ZAKAJ IMAJO RAZLIČNE OBRESTNE MERE.docx
</commit_message>
<xml_diff>
--- a/clanki/VRSTE KREDITOV IN ZAKAJ IMAJO RAZLIČNE OBRESTNE MERE.docx
+++ b/clanki/VRSTE KREDITOV IN ZAKAJ IMAJO RAZLIČNE OBRESTNE MERE.docx
@@ -1339,35 +1339,23 @@
       <w:pPr>
         <w:spacing w:after="0" w:line="240" w:lineRule="auto"/>
         <w:rPr>
-          <w:color w:val="EE0000"/>
-          <w:lang w:val="sl-SI"/>
-        </w:rPr>
-      </w:pPr>
-    </w:p>
-    <w:p>
-      <w:pPr>
-        <w:spacing w:after="0" w:line="240" w:lineRule="auto"/>
-        <w:rPr>
-          <w:color w:val="EE0000"/>
-          <w:lang w:val="sl-SI"/>
-        </w:rPr>
-      </w:pPr>
-    </w:p>
-    <w:p>
-      <w:pPr>
-        <w:spacing w:after="0" w:line="240" w:lineRule="auto"/>
-        <w:rPr>
-          <w:b/>
-          <w:bCs/>
-          <w:color w:val="EE0000"/>
-          <w:lang w:val="sl-SI"/>
-        </w:rPr>
-      </w:pPr>
-      <w:r>
-        <w:rPr>
-          <w:b/>
-          <w:bCs/>
-          <w:color w:val="EE0000"/>
+          <w:lang w:val="sl-SI"/>
+        </w:rPr>
+      </w:pPr>
+    </w:p>
+    <w:p>
+      <w:pPr>
+        <w:spacing w:after="0" w:line="240" w:lineRule="auto"/>
+        <w:rPr>
+          <w:b/>
+          <w:bCs/>
+          <w:lang w:val="sl-SI"/>
+        </w:rPr>
+      </w:pPr>
+      <w:r>
+        <w:rPr>
+          <w:b/>
+          <w:bCs/>
           <w:lang w:val="sl-SI"/>
         </w:rPr>
         <w:t>Zakaj imajo različni krediti različne obrestne mere</w:t>
@@ -1377,92 +1365,189 @@
       <w:pPr>
         <w:spacing w:after="0" w:line="240" w:lineRule="auto"/>
         <w:rPr>
-          <w:color w:val="EE0000"/>
-          <w:lang w:val="sl-SI"/>
-        </w:rPr>
-      </w:pPr>
-      <w:r>
-        <w:rPr>
-          <w:color w:val="EE0000"/>
-          <w:lang w:val="sl-SI"/>
-        </w:rPr>
-        <w:t>Obrestna mera ni nekaj, kar banka določi “po občutku”. Gre za rezultat ocene tveganja. Večje kot je tveganje, višja bo obrestna mera. Manjše kot je tveganje, nižja bo obrestna mera.</w:t>
-      </w:r>
-    </w:p>
-    <w:p>
-      <w:pPr>
-        <w:spacing w:after="0" w:line="240" w:lineRule="auto"/>
-        <w:rPr>
-          <w:color w:val="EE0000"/>
-          <w:lang w:val="sl-SI"/>
-        </w:rPr>
-      </w:pPr>
-    </w:p>
-    <w:p>
-      <w:pPr>
-        <w:spacing w:after="0" w:line="240" w:lineRule="auto"/>
-        <w:rPr>
-          <w:color w:val="EE0000"/>
-          <w:lang w:val="sl-SI"/>
-        </w:rPr>
-      </w:pPr>
-      <w:r>
-        <w:rPr>
-          <w:color w:val="EE0000"/>
-          <w:lang w:val="sl-SI"/>
-        </w:rPr>
-        <w:t>Pri potrošniškem kreditu je tveganje največje, ker ni zavarovanja in banka ne pozna namena. Pri avtokreditu je tveganje manjše, ker je avto zavarovanje. Pri stanovanjskem kreditu je tveganje najmanjše, ker je nepremičnina močno zavarovanje. Pri podjetniških kreditih je tveganje spet večje, ker so prihodki podjetnika nepredvidljivi.</w:t>
-      </w:r>
-    </w:p>
-    <w:p>
-      <w:pPr>
-        <w:spacing w:after="0" w:line="240" w:lineRule="auto"/>
-        <w:rPr>
-          <w:color w:val="EE0000"/>
-          <w:lang w:val="sl-SI"/>
-        </w:rPr>
-      </w:pPr>
-    </w:p>
-    <w:p>
-      <w:pPr>
-        <w:spacing w:after="0" w:line="240" w:lineRule="auto"/>
-        <w:rPr>
-          <w:color w:val="EE0000"/>
-          <w:lang w:val="sl-SI"/>
-        </w:rPr>
-      </w:pPr>
-      <w:r>
-        <w:rPr>
-          <w:color w:val="EE0000"/>
-          <w:lang w:val="sl-SI"/>
-        </w:rPr>
-        <w:t>Poleg tveganja na obrestno mero vplivajo tudi drugi dejavniki: doba odplačevanja, stabilnost prihodkov komitenta, kreditna zgodovina, stroški zavarovanja, stroški odobritve in celo splošne razmere na finančnih trgih.</w:t>
-      </w:r>
-    </w:p>
-    <w:p>
-      <w:pPr>
-        <w:spacing w:after="0" w:line="240" w:lineRule="auto"/>
-        <w:rPr>
-          <w:color w:val="EE0000"/>
-          <w:lang w:val="sl-SI"/>
-        </w:rPr>
-      </w:pPr>
-    </w:p>
-    <w:p>
-      <w:pPr>
-        <w:spacing w:after="0" w:line="240" w:lineRule="auto"/>
-        <w:rPr>
-          <w:b/>
-          <w:bCs/>
-          <w:color w:val="EE0000"/>
-          <w:lang w:val="sl-SI"/>
-        </w:rPr>
-      </w:pPr>
-      <w:r>
-        <w:rPr>
-          <w:b/>
-          <w:bCs/>
-          <w:color w:val="EE0000"/>
+          <w:lang w:val="sl-SI"/>
+        </w:rPr>
+      </w:pPr>
+      <w:r>
+        <w:rPr>
+          <w:lang w:val="sl-SI"/>
+        </w:rPr>
+        <w:t>Obrestna mera ni nekaj, kar banka določi</w:t>
+      </w:r>
+      <w:r>
+        <w:rPr>
+          <w:lang w:val="sl-SI"/>
+        </w:rPr>
+        <w:t xml:space="preserve"> »</w:t>
+      </w:r>
+      <w:r>
+        <w:rPr>
+          <w:lang w:val="sl-SI"/>
+        </w:rPr>
+        <w:t>po občutku</w:t>
+      </w:r>
+      <w:r>
+        <w:rPr>
+          <w:lang w:val="sl-SI"/>
+        </w:rPr>
+        <w:t>«</w:t>
+      </w:r>
+      <w:r>
+        <w:rPr>
+          <w:lang w:val="sl-SI"/>
+        </w:rPr>
+        <w:t xml:space="preserve">. Gre za rezultat </w:t>
+      </w:r>
+      <w:r>
+        <w:rPr>
+          <w:lang w:val="sl-SI"/>
+        </w:rPr>
+        <w:t xml:space="preserve">cene denarja na medbančnem trgu in </w:t>
+      </w:r>
+      <w:r>
+        <w:rPr>
+          <w:lang w:val="sl-SI"/>
+        </w:rPr>
+        <w:t>ocene tveganja</w:t>
+      </w:r>
+      <w:r>
+        <w:rPr>
+          <w:lang w:val="sl-SI"/>
+        </w:rPr>
+        <w:t xml:space="preserve"> ki ga banka določi za posel</w:t>
+      </w:r>
+      <w:r>
+        <w:rPr>
+          <w:lang w:val="sl-SI"/>
+        </w:rPr>
+        <w:t>. Večje kot je tveganje, višja bo obrestna mera</w:t>
+      </w:r>
+      <w:r>
+        <w:rPr>
+          <w:lang w:val="sl-SI"/>
+        </w:rPr>
+        <w:t xml:space="preserve"> in obratno</w:t>
+      </w:r>
+      <w:r>
+        <w:rPr>
+          <w:lang w:val="sl-SI"/>
+        </w:rPr>
+        <w:t>.</w:t>
+      </w:r>
+    </w:p>
+    <w:p>
+      <w:pPr>
+        <w:spacing w:after="0" w:line="240" w:lineRule="auto"/>
+        <w:rPr>
+          <w:lang w:val="sl-SI"/>
+        </w:rPr>
+      </w:pPr>
+    </w:p>
+    <w:p>
+      <w:pPr>
+        <w:spacing w:after="0" w:line="240" w:lineRule="auto"/>
+        <w:rPr>
+          <w:lang w:val="sl-SI"/>
+        </w:rPr>
+      </w:pPr>
+      <w:r>
+        <w:rPr>
+          <w:lang w:val="sl-SI"/>
+        </w:rPr>
+        <w:t>Pri potrošniškem kreditu je tveganje največje, ker ni zavarovanja in banka ne pozna namena. Pri avtokreditu je tveganje manjše, ker je avto zavarovanje. Pri stanovanjskem kreditu je tveganje najmanjše, ker je nepremičnina močno</w:t>
+      </w:r>
+      <w:r>
+        <w:rPr>
+          <w:lang w:val="sl-SI"/>
+        </w:rPr>
+        <w:t>, stvarno</w:t>
+      </w:r>
+      <w:r>
+        <w:rPr>
+          <w:lang w:val="sl-SI"/>
+        </w:rPr>
+        <w:t xml:space="preserve"> zavarovanje. Pri podjetniških kreditih je tveganje spet večje, ker so prihodki podjetnika nepredvidljivi.</w:t>
+      </w:r>
+    </w:p>
+    <w:p>
+      <w:pPr>
+        <w:spacing w:after="0" w:line="240" w:lineRule="auto"/>
+        <w:rPr>
+          <w:lang w:val="sl-SI"/>
+        </w:rPr>
+      </w:pPr>
+    </w:p>
+    <w:p>
+      <w:pPr>
+        <w:spacing w:after="0" w:line="240" w:lineRule="auto"/>
+        <w:rPr>
+          <w:lang w:val="sl-SI"/>
+        </w:rPr>
+      </w:pPr>
+      <w:r>
+        <w:rPr>
+          <w:lang w:val="sl-SI"/>
+        </w:rPr>
+        <w:t>Poleg tveganja na obrestno mero vplivajo tudi drugi dejavniki</w:t>
+      </w:r>
+      <w:r>
+        <w:rPr>
+          <w:lang w:val="sl-SI"/>
+        </w:rPr>
+        <w:t>, in sicer:</w:t>
+      </w:r>
+      <w:r>
+        <w:rPr>
+          <w:lang w:val="sl-SI"/>
+        </w:rPr>
+        <w:t xml:space="preserve"> doba odplačevanja, stabilnost prihodkov komitenta, kreditna </w:t>
+      </w:r>
+      <w:r>
+        <w:rPr>
+          <w:lang w:val="sl-SI"/>
+        </w:rPr>
+        <w:t xml:space="preserve">oz. plčailna </w:t>
+      </w:r>
+      <w:r>
+        <w:rPr>
+          <w:lang w:val="sl-SI"/>
+        </w:rPr>
+        <w:t xml:space="preserve">zgodovina, stroški zavarovanja, stroški odobritve in </w:t>
+      </w:r>
+      <w:r>
+        <w:rPr>
+          <w:lang w:val="sl-SI"/>
+        </w:rPr>
+        <w:t>nenazadnje</w:t>
+      </w:r>
+      <w:r>
+        <w:rPr>
+          <w:lang w:val="sl-SI"/>
+        </w:rPr>
+        <w:t xml:space="preserve"> splošne razmere na finančnih trgih.</w:t>
+      </w:r>
+    </w:p>
+    <w:p>
+      <w:pPr>
+        <w:spacing w:after="0" w:line="240" w:lineRule="auto"/>
+        <w:rPr>
+          <w:lang w:val="sl-SI"/>
+        </w:rPr>
+      </w:pPr>
+    </w:p>
+    <w:p>
+      <w:pPr>
+        <w:spacing w:after="0" w:line="240" w:lineRule="auto"/>
+        <w:rPr>
+          <w:b/>
+          <w:bCs/>
+          <w:lang w:val="sl-SI"/>
+        </w:rPr>
+      </w:pPr>
+      <w:r>
+        <w:rPr>
+          <w:b/>
+          <w:bCs/>
           <w:lang w:val="sl-SI"/>
         </w:rPr>
         <w:t>Kako izbrati pravi kredit</w:t>
@@ -1472,38 +1557,141 @@
       <w:pPr>
         <w:spacing w:after="0" w:line="240" w:lineRule="auto"/>
         <w:rPr>
-          <w:color w:val="EE0000"/>
-          <w:lang w:val="sl-SI"/>
-        </w:rPr>
-      </w:pPr>
-      <w:r>
-        <w:rPr>
-          <w:color w:val="EE0000"/>
-          <w:lang w:val="sl-SI"/>
-        </w:rPr>
-        <w:t>Najprej moraš jasno določiti namen. Če kupuješ stanovanje, je stanovanjski kredit edina smiselna izbira. Če kupuješ avto, je avtokredit običajno cenejši od potrošniškega. Če potrebuješ denar za različne manjše stvari, je potrošniški kredit najhitrejša rešitev, a tudi najdražja.</w:t>
-      </w:r>
-    </w:p>
-    <w:p>
-      <w:pPr>
-        <w:spacing w:after="0" w:line="240" w:lineRule="auto"/>
-        <w:rPr>
-          <w:color w:val="EE0000"/>
-          <w:lang w:val="sl-SI"/>
-        </w:rPr>
-      </w:pPr>
-    </w:p>
-    <w:p>
-      <w:pPr>
-        <w:spacing w:after="0" w:line="240" w:lineRule="auto"/>
-        <w:rPr>
-          <w:color w:val="EE0000"/>
-          <w:lang w:val="sl-SI"/>
-        </w:rPr>
-      </w:pPr>
-      <w:r>
-        <w:rPr>
-          <w:color w:val="EE0000"/>
+          <w:lang w:val="sl-SI"/>
+        </w:rPr>
+      </w:pPr>
+      <w:r>
+        <w:rPr>
+          <w:lang w:val="sl-SI"/>
+        </w:rPr>
+        <w:t xml:space="preserve">Najprej moraš jasno določiti namen. </w:t>
+      </w:r>
+      <w:r>
+        <w:rPr>
+          <w:lang w:val="sl-SI"/>
+        </w:rPr>
+        <w:t>Če potrebuješ denar za različne manjše stvari, je potrošniški kredit najhitrejša rešitev, a tudi najdražja.</w:t>
+      </w:r>
+      <w:r>
+        <w:rPr>
+          <w:lang w:val="sl-SI"/>
+        </w:rPr>
+        <w:t xml:space="preserve"> </w:t>
+      </w:r>
+      <w:r>
+        <w:rPr>
+          <w:lang w:val="sl-SI"/>
+        </w:rPr>
+        <w:t xml:space="preserve">Če kupuješ stanovanje, je stanovanjski kredit edina smiselna izbira. </w:t>
+      </w:r>
+      <w:r>
+        <w:rPr>
+          <w:lang w:val="sl-SI"/>
+        </w:rPr>
+        <w:t>Če kupuješ avto, je avtokredit pogosto cenejši od potrošniškega</w:t>
+      </w:r>
+      <w:r>
+        <w:rPr>
+          <w:lang w:val="sl-SI"/>
+        </w:rPr>
+        <w:t xml:space="preserve"> kredita</w:t>
+      </w:r>
+      <w:r>
+        <w:rPr>
+          <w:lang w:val="sl-SI"/>
+        </w:rPr>
+        <w:t xml:space="preserve">, vendar </w:t>
+      </w:r>
+      <w:r>
+        <w:rPr>
+          <w:lang w:val="sl-SI"/>
+        </w:rPr>
+        <w:t xml:space="preserve">ga </w:t>
+      </w:r>
+      <w:r>
+        <w:rPr>
+          <w:lang w:val="sl-SI"/>
+        </w:rPr>
+        <w:t xml:space="preserve">je </w:t>
+      </w:r>
+      <w:r>
+        <w:rPr>
+          <w:lang w:val="sl-SI"/>
+        </w:rPr>
+        <w:t>pametno</w:t>
+      </w:r>
+      <w:r>
+        <w:rPr>
+          <w:lang w:val="sl-SI"/>
+        </w:rPr>
+        <w:t xml:space="preserve"> primerjati tudi</w:t>
+      </w:r>
+      <w:r>
+        <w:rPr>
+          <w:lang w:val="sl-SI"/>
+        </w:rPr>
+        <w:t xml:space="preserve"> z</w:t>
+      </w:r>
+      <w:r>
+        <w:rPr>
+          <w:lang w:val="sl-SI"/>
+        </w:rPr>
+        <w:t xml:space="preserve"> leasing</w:t>
+      </w:r>
+      <w:r>
+        <w:rPr>
+          <w:lang w:val="sl-SI"/>
+        </w:rPr>
+        <w:t>om. K</w:t>
+      </w:r>
+      <w:r>
+        <w:rPr>
+          <w:lang w:val="sl-SI"/>
+        </w:rPr>
+        <w:t xml:space="preserve">ončna odločitev </w:t>
+      </w:r>
+      <w:r>
+        <w:rPr>
+          <w:lang w:val="sl-SI"/>
+        </w:rPr>
+        <w:t xml:space="preserve">je pogosto </w:t>
+      </w:r>
+      <w:r>
+        <w:rPr>
+          <w:lang w:val="sl-SI"/>
+        </w:rPr>
+        <w:t>odvisna od številnih podrobnosti posamezne ponudbe</w:t>
+      </w:r>
+      <w:r>
+        <w:rPr>
+          <w:lang w:val="sl-SI"/>
+        </w:rPr>
+        <w:t xml:space="preserve">, saj </w:t>
+      </w:r>
+      <w:r>
+        <w:rPr>
+          <w:lang w:val="sl-SI"/>
+        </w:rPr>
+        <w:t>cena ni vedno edini dejavnik.</w:t>
+      </w:r>
+    </w:p>
+    <w:p>
+      <w:pPr>
+        <w:spacing w:after="0" w:line="240" w:lineRule="auto"/>
+        <w:rPr>
+          <w:lang w:val="sl-SI"/>
+        </w:rPr>
+      </w:pPr>
+    </w:p>
+    <w:p>
+      <w:pPr>
+        <w:spacing w:after="0" w:line="240" w:lineRule="auto"/>
+        <w:rPr>
+          <w:lang w:val="sl-SI"/>
+        </w:rPr>
+      </w:pPr>
+      <w:r>
+        <w:rPr>
           <w:lang w:val="sl-SI"/>
         </w:rPr>
         <w:t>Drugi korak je razumevanje zavarovanja. Močnejše zavarovanje pomeni nižjo obrestno mero. Hipoteka je najmočnejše zavarovanje, zato so stanovanjski krediti najcenejši. Zavarovanje pri zavarovalnici je šibkejše, zato so potrošniški krediti dražji.</w:t>
@@ -1513,67 +1701,127 @@
       <w:pPr>
         <w:spacing w:after="0" w:line="240" w:lineRule="auto"/>
         <w:rPr>
-          <w:color w:val="EE0000"/>
-          <w:lang w:val="sl-SI"/>
-        </w:rPr>
-      </w:pPr>
-    </w:p>
-    <w:p>
-      <w:pPr>
-        <w:spacing w:after="0" w:line="240" w:lineRule="auto"/>
-        <w:rPr>
-          <w:color w:val="EE0000"/>
-          <w:lang w:val="sl-SI"/>
-        </w:rPr>
-      </w:pPr>
-      <w:r>
-        <w:rPr>
-          <w:color w:val="EE0000"/>
-          <w:lang w:val="sl-SI"/>
-        </w:rPr>
-        <w:t>Tretji korak je pogled na EOM – efektivno obrestno mero. Obrestna mera sama po sebi ne pove celotne zgodbe. EOM vključuje vse stroške kredita in pokaže, koliko kredit v resnici stane. Dve banki lahko imata enako obrestno mero, a zelo različno EOM, če ima ena višje stroške odobritve ali zavarovanja.</w:t>
-      </w:r>
-    </w:p>
-    <w:p>
-      <w:pPr>
-        <w:spacing w:after="0" w:line="240" w:lineRule="auto"/>
-        <w:rPr>
-          <w:color w:val="EE0000"/>
-          <w:lang w:val="sl-SI"/>
-        </w:rPr>
-      </w:pPr>
-      <w:r>
-        <w:rPr>
-          <w:color w:val="EE0000"/>
-          <w:lang w:val="sl-SI"/>
-        </w:rPr>
-        <w:t>Četrti korak je uporaba kalkulatorja. Šele ko vidiš mesečni obrok, skupni strošek in vpliv dobe odplačevanja, lahko realno oceniš, ali si kredit lahko privoščiš.</w:t>
-      </w:r>
-    </w:p>
-    <w:p>
-      <w:pPr>
-        <w:spacing w:after="0" w:line="240" w:lineRule="auto"/>
-        <w:rPr>
-          <w:color w:val="EE0000"/>
-          <w:lang w:val="sl-SI"/>
-        </w:rPr>
-      </w:pPr>
-    </w:p>
-    <w:p>
-      <w:pPr>
-        <w:spacing w:after="0" w:line="240" w:lineRule="auto"/>
-        <w:rPr>
-          <w:b/>
-          <w:bCs/>
-          <w:color w:val="EE0000"/>
-          <w:lang w:val="sl-SI"/>
-        </w:rPr>
-      </w:pPr>
-      <w:r>
-        <w:rPr>
-          <w:b/>
-          <w:bCs/>
-          <w:color w:val="EE0000"/>
+          <w:lang w:val="sl-SI"/>
+        </w:rPr>
+      </w:pPr>
+    </w:p>
+    <w:p>
+      <w:pPr>
+        <w:spacing w:after="0" w:line="240" w:lineRule="auto"/>
+        <w:rPr>
+          <w:lang w:val="sl-SI"/>
+        </w:rPr>
+      </w:pPr>
+      <w:r>
+        <w:rPr>
+          <w:lang w:val="sl-SI"/>
+        </w:rPr>
+        <w:t xml:space="preserve">Tretji korak je pogled na EOM </w:t>
+      </w:r>
+      <w:r>
+        <w:rPr>
+          <w:lang w:val="sl-SI"/>
+        </w:rPr>
+        <w:t>(</w:t>
+      </w:r>
+      <w:r>
+        <w:rPr>
+          <w:lang w:val="sl-SI"/>
+        </w:rPr>
+        <w:t>efektivno obrestno mero</w:t>
+      </w:r>
+      <w:r>
+        <w:rPr>
+          <w:lang w:val="sl-SI"/>
+        </w:rPr>
+        <w:t>)</w:t>
+      </w:r>
+      <w:r>
+        <w:rPr>
+          <w:lang w:val="sl-SI"/>
+        </w:rPr>
+        <w:t>. Obrestna mera sama po sebi ne pove celotne zgodbe. EOM vključuje vse stroške kredita in pokaže, koliko kredit v resnici stane. Dve banki lahko imata enako obrestno mero, a zelo različno EOM, če ima ena višje stroške odobritve ali zavarovanja.</w:t>
+      </w:r>
+    </w:p>
+    <w:p>
+      <w:pPr>
+        <w:spacing w:after="0" w:line="240" w:lineRule="auto"/>
+        <w:rPr>
+          <w:lang w:val="sl-SI"/>
+        </w:rPr>
+      </w:pPr>
+    </w:p>
+    <w:p>
+      <w:pPr>
+        <w:spacing w:after="0" w:line="240" w:lineRule="auto"/>
+        <w:rPr>
+          <w:lang w:val="sl-SI"/>
+        </w:rPr>
+      </w:pPr>
+      <w:r>
+        <w:rPr>
+          <w:lang w:val="sl-SI"/>
+        </w:rPr>
+        <w:t xml:space="preserve">Četrti korak je </w:t>
+      </w:r>
+      <w:r>
+        <w:rPr>
+          <w:lang w:val="sl-SI"/>
+        </w:rPr>
+        <w:t xml:space="preserve">primerjaa izračunov oz. </w:t>
+      </w:r>
+      <w:r>
+        <w:rPr>
+          <w:lang w:val="sl-SI"/>
+        </w:rPr>
+        <w:t xml:space="preserve">uporaba kalkulatorja. Šele ko vidiš </w:t>
+      </w:r>
+      <w:r>
+        <w:rPr>
+          <w:lang w:val="sl-SI"/>
+        </w:rPr>
+        <w:t xml:space="preserve">dejanski </w:t>
+      </w:r>
+      <w:r>
+        <w:rPr>
+          <w:lang w:val="sl-SI"/>
+        </w:rPr>
+        <w:t xml:space="preserve">mesečni obrok, skupni strošek in vpliv dobe odplačevanja, lahko realno oceniš, ali si kredit lahko </w:t>
+      </w:r>
+      <w:r>
+        <w:rPr>
+          <w:lang w:val="sl-SI"/>
+        </w:rPr>
+        <w:t xml:space="preserve">tudi </w:t>
+      </w:r>
+      <w:r>
+        <w:rPr>
+          <w:lang w:val="sl-SI"/>
+        </w:rPr>
+        <w:t>privoščiš.</w:t>
+      </w:r>
+    </w:p>
+    <w:p>
+      <w:pPr>
+        <w:spacing w:after="0" w:line="240" w:lineRule="auto"/>
+        <w:rPr>
+          <w:lang w:val="sl-SI"/>
+        </w:rPr>
+      </w:pPr>
+    </w:p>
+    <w:p>
+      <w:pPr>
+        <w:spacing w:after="0" w:line="240" w:lineRule="auto"/>
+        <w:rPr>
+          <w:b/>
+          <w:bCs/>
+          <w:lang w:val="sl-SI"/>
+        </w:rPr>
+      </w:pPr>
+      <w:r>
+        <w:rPr>
+          <w:b/>
+          <w:bCs/>
           <w:lang w:val="sl-SI"/>
         </w:rPr>
         <w:t>Zaključek</w:t>
@@ -1583,48 +1831,67 @@
       <w:pPr>
         <w:spacing w:after="0" w:line="240" w:lineRule="auto"/>
         <w:rPr>
-          <w:color w:val="EE0000"/>
-          <w:lang w:val="sl-SI"/>
-        </w:rPr>
-      </w:pPr>
-      <w:r>
-        <w:rPr>
-          <w:color w:val="EE0000"/>
-          <w:lang w:val="sl-SI"/>
-        </w:rPr>
-        <w:t>Različni krediti obstajajo zato, ker imajo različne namene, različna tveganja in različna zavarovanja. Banka pri vsakem kreditu oceni, koliko tveganja prevzema, in temu prilagodi obrestno mero. Če razumeš logiko za tem, lahko izbereš kredit, ki je zate najprimernejši in najcenejši.</w:t>
-      </w:r>
-    </w:p>
-    <w:p>
-      <w:pPr>
-        <w:spacing w:after="0" w:line="240" w:lineRule="auto"/>
-        <w:rPr>
-          <w:color w:val="EE0000"/>
-          <w:lang w:val="sl-SI"/>
-        </w:rPr>
-      </w:pPr>
-    </w:p>
-    <w:p>
-      <w:pPr>
-        <w:spacing w:after="0" w:line="240" w:lineRule="auto"/>
-        <w:rPr>
-          <w:color w:val="EE0000"/>
-          <w:lang w:val="sl-SI"/>
-        </w:rPr>
-      </w:pPr>
-      <w:r>
-        <w:rPr>
-          <w:color w:val="EE0000"/>
-          <w:lang w:val="sl-SI"/>
-        </w:rPr>
-        <w:t>FinPortal.si je ustvarjen prav zato, da ti pomaga razumeti te razlike. Ko razumeš, kako banke razmišljajo, postaneš močnejši pogajalec in bolj samozavesten komitent. In to je cilj: da greš v banko pripravljen, ne prestrašen.</w:t>
-      </w:r>
-    </w:p>
-    <w:p>
-      <w:pPr>
-        <w:spacing w:after="0" w:line="240" w:lineRule="auto"/>
-        <w:rPr>
-          <w:color w:val="EE0000"/>
+          <w:lang w:val="sl-SI"/>
+        </w:rPr>
+      </w:pPr>
+      <w:r>
+        <w:rPr>
+          <w:lang w:val="sl-SI"/>
+        </w:rPr>
+        <w:t xml:space="preserve">Različni krediti obstajajo zato, ker imajo različne namene, različna tveganja in različna zavarovanja. Banka pri vsakem kreditu oceni, koliko tveganja prevzema in temu prilagodi obrestno mero. Če razumeš logiko za tem, lahko izbereš kredit, ki je zate najprimernejši in </w:t>
+      </w:r>
+      <w:r>
+        <w:rPr>
+          <w:lang w:val="sl-SI"/>
+        </w:rPr>
+        <w:t>najugodnejši</w:t>
+      </w:r>
+      <w:r>
+        <w:rPr>
+          <w:lang w:val="sl-SI"/>
+        </w:rPr>
+        <w:t>.</w:t>
+      </w:r>
+    </w:p>
+    <w:p>
+      <w:pPr>
+        <w:spacing w:after="0" w:line="240" w:lineRule="auto"/>
+        <w:rPr>
+          <w:lang w:val="sl-SI"/>
+        </w:rPr>
+      </w:pPr>
+    </w:p>
+    <w:p>
+      <w:pPr>
+        <w:spacing w:after="0" w:line="240" w:lineRule="auto"/>
+        <w:rPr>
+          <w:lang w:val="sl-SI"/>
+        </w:rPr>
+      </w:pPr>
+      <w:r>
+        <w:rPr>
+          <w:lang w:val="sl-SI"/>
+        </w:rPr>
+        <w:lastRenderedPageBreak/>
+        <w:t xml:space="preserve">FinPortal.si je ustvarjen prav zato, da ti pomaga razumeti te razlike. Ko razumeš, kako banke razmišljajo, postaneš močnejši pogajalec in bolj samozavesten komitent. In to je </w:t>
+      </w:r>
+      <w:r>
+        <w:rPr>
+          <w:lang w:val="sl-SI"/>
+        </w:rPr>
+        <w:t xml:space="preserve">naš </w:t>
+      </w:r>
+      <w:r>
+        <w:rPr>
+          <w:lang w:val="sl-SI"/>
+        </w:rPr>
+        <w:t>cilj: da greš v banko pripravljen, ne prestrašen.</w:t>
+      </w:r>
+    </w:p>
+    <w:p>
+      <w:pPr>
+        <w:spacing w:after="0" w:line="240" w:lineRule="auto"/>
+        <w:rPr>
           <w:lang w:val="sl-SI"/>
         </w:rPr>
       </w:pPr>

</xml_diff>

<commit_message>
članek napisan v wordu
</commit_message>
<xml_diff>
--- a/clanki/VRSTE KREDITOV IN ZAKAJ IMAJO RAZLIČNE OBRESTNE MERE.docx
+++ b/clanki/VRSTE KREDITOV IN ZAKAJ IMAJO RAZLIČNE OBRESTNE MERE.docx
@@ -650,184 +650,190 @@
       <w:pPr>
         <w:spacing w:after="0" w:line="240" w:lineRule="auto"/>
         <w:rPr>
-          <w:color w:val="538135" w:themeColor="accent6" w:themeShade="BF"/>
-          <w:lang w:val="sl-SI"/>
-        </w:rPr>
-      </w:pPr>
-      <w:r>
-        <w:rPr>
-          <w:color w:val="538135" w:themeColor="accent6" w:themeShade="BF"/>
-          <w:lang w:val="sl-SI"/>
-        </w:rPr>
-        <w:t>Namenski kredit za nakup, gradnjo ali prenovo nepremičnine.</w:t>
-      </w:r>
-    </w:p>
-    <w:p>
-      <w:pPr>
-        <w:spacing w:after="0" w:line="240" w:lineRule="auto"/>
-        <w:rPr>
-          <w:b/>
-          <w:bCs/>
-          <w:color w:val="EE0000"/>
-          <w:lang w:val="sl-SI"/>
-        </w:rPr>
-      </w:pPr>
-    </w:p>
-    <w:p>
-      <w:pPr>
-        <w:spacing w:after="0" w:line="240" w:lineRule="auto"/>
-        <w:rPr>
-          <w:color w:val="EE0000"/>
-          <w:lang w:val="sl-SI"/>
-        </w:rPr>
-      </w:pPr>
-      <w:r>
-        <w:rPr>
-          <w:color w:val="EE0000"/>
-          <w:lang w:val="sl-SI"/>
-        </w:rPr>
-        <w:t>Stanovanjski kredit je povsem druga zgodba. Gre za kredit, ki ga ljudje najpogosteje jemljejo za nakup stanovanja ali hiše, gradnjo, adaptacijo ali refinanciranje obstoječega stanovanjskega kredita. To je kredit z najnižjo obrestno mero, a tudi z najzahtevnejšimi pogoji.</w:t>
-      </w:r>
-    </w:p>
-    <w:p>
-      <w:pPr>
-        <w:spacing w:after="0" w:line="240" w:lineRule="auto"/>
-        <w:rPr>
-          <w:color w:val="EE0000"/>
-          <w:lang w:val="sl-SI"/>
-        </w:rPr>
-      </w:pPr>
-    </w:p>
-    <w:p>
-      <w:pPr>
-        <w:spacing w:after="0" w:line="240" w:lineRule="auto"/>
-        <w:rPr>
-          <w:color w:val="EE0000"/>
-          <w:lang w:val="sl-SI"/>
-        </w:rPr>
-      </w:pPr>
-      <w:r>
-        <w:rPr>
-          <w:color w:val="EE0000"/>
-          <w:lang w:val="sl-SI"/>
-        </w:rPr>
-        <w:t>Zakaj je tako poceni? Ker je nepremičnina izjemno močno zavarovanje. Banka ima na nepremičnini hipoteko, kar pomeni, da lahko v skrajnem primeru nepremičnino proda in poplača dolg. Tveganje je zato bistveno manjše kot pri potrošniškem ali avtokreditu.</w:t>
-      </w:r>
-    </w:p>
-    <w:p>
-      <w:pPr>
-        <w:spacing w:after="0" w:line="240" w:lineRule="auto"/>
-        <w:rPr>
-          <w:color w:val="EE0000"/>
-          <w:lang w:val="sl-SI"/>
-        </w:rPr>
-      </w:pPr>
-    </w:p>
-    <w:p>
-      <w:pPr>
-        <w:spacing w:after="0" w:line="240" w:lineRule="auto"/>
-        <w:rPr>
-          <w:color w:val="EE0000"/>
-          <w:lang w:val="sl-SI"/>
-        </w:rPr>
-      </w:pPr>
-      <w:r>
-        <w:rPr>
-          <w:color w:val="EE0000"/>
+          <w:lang w:val="sl-SI"/>
+        </w:rPr>
+      </w:pPr>
+      <w:r>
+        <w:rPr>
+          <w:lang w:val="sl-SI"/>
+        </w:rPr>
+        <w:t>Stanovanjski kredit je povsem druga zgodba</w:t>
+      </w:r>
+      <w:r>
+        <w:rPr>
+          <w:lang w:val="sl-SI"/>
+        </w:rPr>
+        <w:t>, saj g</w:t>
+      </w:r>
+      <w:r>
+        <w:rPr>
+          <w:lang w:val="sl-SI"/>
+        </w:rPr>
+        <w:t>re za kredit, ki ga ljudje najpogosteje jemljejo za nakup stanovanja ali hiše, gradnjo, adaptacijo ali refinanciranje obstoječega stanovanjskega kredita. To je kredit z najnižjo obrestno mero, a hkrati z najzahtevnejšimi pogoji.</w:t>
+      </w:r>
+    </w:p>
+    <w:p>
+      <w:pPr>
+        <w:spacing w:after="0" w:line="240" w:lineRule="auto"/>
+        <w:rPr>
+          <w:lang w:val="sl-SI"/>
+        </w:rPr>
+      </w:pPr>
+    </w:p>
+    <w:p>
+      <w:pPr>
+        <w:spacing w:after="0" w:line="240" w:lineRule="auto"/>
+        <w:rPr>
+          <w:lang w:val="sl-SI"/>
+        </w:rPr>
+      </w:pPr>
+      <w:r>
+        <w:rPr>
+          <w:lang w:val="sl-SI"/>
+        </w:rPr>
+        <w:t>Zakaj je tako ugoden? Ker je nepremičnina izjemno močno zavarovanje</w:t>
+      </w:r>
+      <w:r>
+        <w:rPr>
+          <w:lang w:val="sl-SI"/>
+        </w:rPr>
+        <w:t>, banka pa</w:t>
+      </w:r>
+      <w:r>
+        <w:rPr>
+          <w:lang w:val="sl-SI"/>
+        </w:rPr>
+        <w:t xml:space="preserve"> ima na njej hipoteko, kar pomeni, da lahko v </w:t>
+      </w:r>
+      <w:r>
+        <w:rPr>
+          <w:lang w:val="sl-SI"/>
+        </w:rPr>
+        <w:t>primeru črnega scenarija</w:t>
+      </w:r>
+      <w:r>
+        <w:rPr>
+          <w:lang w:val="sl-SI"/>
+        </w:rPr>
+        <w:t xml:space="preserve"> nepremičnino proda in poplača dolg. Tveganje je zato bistveno manjše kot pri potrošniškem ali avtokreditu.</w:t>
+      </w:r>
+    </w:p>
+    <w:p>
+      <w:pPr>
+        <w:spacing w:after="0" w:line="240" w:lineRule="auto"/>
+        <w:rPr>
+          <w:lang w:val="sl-SI"/>
+        </w:rPr>
+      </w:pPr>
+    </w:p>
+    <w:p>
+      <w:pPr>
+        <w:spacing w:after="0" w:line="240" w:lineRule="auto"/>
+        <w:rPr>
+          <w:lang w:val="sl-SI"/>
+        </w:rPr>
+      </w:pPr>
+      <w:r>
+        <w:rPr>
           <w:lang w:val="sl-SI"/>
         </w:rPr>
         <w:t>Doba odplačevanja je dolga</w:t>
       </w:r>
       <w:r>
         <w:rPr>
-          <w:color w:val="EE0000"/>
           <w:lang w:val="sl-SI"/>
         </w:rPr>
         <w:t>,</w:t>
       </w:r>
       <w:r>
         <w:rPr>
-          <w:color w:val="EE0000"/>
-          <w:lang w:val="sl-SI"/>
-        </w:rPr>
-        <w:t xml:space="preserve"> pogosto 20, 25 ali celo 30 let. Daljša doba pomeni nižje mesečne obroke, kar zmanjša verjetnost neplačila. A hkrati pomeni, da banka prevzame dolgoročno tveganje, zato zelo natančno preveri komitenta: prihodke, stabilnost zaposlitve, kreditno zgodovino, obstoječe obveznosti in vrednost nepremičnine.</w:t>
-      </w:r>
-    </w:p>
-    <w:p>
-      <w:pPr>
-        <w:spacing w:after="0" w:line="240" w:lineRule="auto"/>
-        <w:rPr>
-          <w:color w:val="EE0000"/>
-          <w:lang w:val="sl-SI"/>
-        </w:rPr>
-      </w:pPr>
-    </w:p>
-    <w:p>
-      <w:pPr>
-        <w:spacing w:after="0" w:line="240" w:lineRule="auto"/>
-        <w:rPr>
-          <w:color w:val="EE0000"/>
-          <w:lang w:val="sl-SI"/>
-        </w:rPr>
-      </w:pPr>
-      <w:r>
-        <w:rPr>
-          <w:color w:val="EE0000"/>
-          <w:lang w:val="sl-SI"/>
-        </w:rPr>
-        <w:t>Stanovanjski kredit je smiseln, kadar kupuješ ali gradiš nepremičnino in želiš najnižjo možno obrestno mero. A pripraviti se moraš na stroške cenitve, notarja, vpis hipoteke in zavarovanja nepremičnine.</w:t>
-      </w:r>
-    </w:p>
-    <w:p>
-      <w:pPr>
-        <w:spacing w:after="0" w:line="240" w:lineRule="auto"/>
-        <w:rPr>
-          <w:color w:val="EE0000"/>
-          <w:lang w:val="sl-SI"/>
-        </w:rPr>
-      </w:pPr>
-    </w:p>
-    <w:p>
-      <w:pPr>
-        <w:spacing w:after="0" w:line="240" w:lineRule="auto"/>
-        <w:rPr>
-          <w:color w:val="538135" w:themeColor="accent6" w:themeShade="BF"/>
-          <w:lang w:val="sl-SI"/>
-        </w:rPr>
-      </w:pPr>
-      <w:r>
-        <w:rPr>
-          <w:color w:val="538135" w:themeColor="accent6" w:themeShade="BF"/>
-          <w:lang w:val="sl-SI"/>
-        </w:rPr>
-        <w:t>Hipotekarni kredit: Posebna oblika stanovanjskega kredita, zavarovanega z zastavno pravico na nepremičnini, običajno z daljšo dobo odplačevanja (do 360 mesecev).</w:t>
-      </w:r>
-    </w:p>
-    <w:p>
-      <w:pPr>
-        <w:spacing w:after="0" w:line="240" w:lineRule="auto"/>
-        <w:rPr>
-          <w:b/>
-          <w:bCs/>
-          <w:lang w:val="sl-SI"/>
-        </w:rPr>
-      </w:pPr>
-    </w:p>
-    <w:p>
-      <w:pPr>
-        <w:spacing w:after="0" w:line="240" w:lineRule="auto"/>
-        <w:rPr>
-          <w:b/>
-          <w:bCs/>
-          <w:lang w:val="sl-SI"/>
-        </w:rPr>
-      </w:pPr>
-      <w:r>
-        <w:rPr>
-          <w:b/>
-          <w:bCs/>
-          <w:lang w:val="sl-SI"/>
-        </w:rPr>
+          <w:lang w:val="sl-SI"/>
+        </w:rPr>
+        <w:t xml:space="preserve"> pogosto 20, 25 ali celo 30 let. Daljša doba pomeni nižje mesečne obroke, kar zmanjšuje verjetnost neplačila</w:t>
+      </w:r>
+      <w:r>
+        <w:rPr>
+          <w:lang w:val="sl-SI"/>
+        </w:rPr>
+        <w:t>, h</w:t>
+      </w:r>
+      <w:r>
+        <w:rPr>
+          <w:lang w:val="sl-SI"/>
+        </w:rPr>
+        <w:t xml:space="preserve">krati pa pomeni, da banka prevzame dolgoročno tveganje, zato zelo natančno preveri </w:t>
+      </w:r>
+      <w:r>
+        <w:rPr>
+          <w:lang w:val="sl-SI"/>
+        </w:rPr>
+        <w:t>kreditojemalca, in sicer</w:t>
+      </w:r>
+      <w:r>
+        <w:rPr>
+          <w:lang w:val="sl-SI"/>
+        </w:rPr>
+        <w:t>: njegove prihodke, stabilnost zaposlitve, kreditno zgodovino, obstoječe obveznosti in vrednost nepremičnine.</w:t>
+      </w:r>
+    </w:p>
+    <w:p>
+      <w:pPr>
+        <w:spacing w:after="0" w:line="240" w:lineRule="auto"/>
+        <w:rPr>
+          <w:lang w:val="sl-SI"/>
+        </w:rPr>
+      </w:pPr>
+    </w:p>
+    <w:p>
+      <w:pPr>
+        <w:spacing w:after="0" w:line="240" w:lineRule="auto"/>
+        <w:rPr>
+          <w:lang w:val="sl-SI"/>
+        </w:rPr>
+      </w:pPr>
+      <w:r>
+        <w:rPr>
+          <w:lang w:val="sl-SI"/>
+        </w:rPr>
+        <w:t xml:space="preserve">Stanovanjski kredit je smiseln, kadar kupuješ ali gradiš nepremičnino in želiš najnižjo možno obrestno mero. A pripraviti se moraš na </w:t>
+      </w:r>
+      <w:r>
+        <w:rPr>
+          <w:lang w:val="sl-SI"/>
+        </w:rPr>
+        <w:t xml:space="preserve">spremljajoče </w:t>
+      </w:r>
+      <w:r>
+        <w:rPr>
+          <w:lang w:val="sl-SI"/>
+        </w:rPr>
+        <w:t>stroške cenitve, notarja, vpis hipoteke in zavarovanje nepremičnine.</w:t>
+      </w:r>
+    </w:p>
+    <w:p>
+      <w:pPr>
+        <w:spacing w:after="0" w:line="240" w:lineRule="auto"/>
+        <w:rPr>
+          <w:lang w:val="sl-SI"/>
+        </w:rPr>
+      </w:pPr>
+    </w:p>
+    <w:p>
+      <w:pPr>
+        <w:spacing w:after="0" w:line="240" w:lineRule="auto"/>
+        <w:rPr>
+          <w:b/>
+          <w:bCs/>
+          <w:lang w:val="sl-SI"/>
+        </w:rPr>
+      </w:pPr>
+      <w:r>
+        <w:rPr>
+          <w:b/>
+          <w:bCs/>
+          <w:lang w:val="sl-SI"/>
+        </w:rPr>
+        <w:lastRenderedPageBreak/>
         <w:t>Avtokredit</w:t>
       </w:r>
       <w:r>
@@ -1365,15 +1371,13 @@
         <w:rPr>
           <w:b/>
           <w:bCs/>
-          <w:color w:val="EE0000"/>
-          <w:lang w:val="sl-SI"/>
-        </w:rPr>
-      </w:pPr>
-      <w:r>
-        <w:rPr>
-          <w:b/>
-          <w:bCs/>
-          <w:color w:val="EE0000"/>
+          <w:lang w:val="sl-SI"/>
+        </w:rPr>
+      </w:pPr>
+      <w:r>
+        <w:rPr>
+          <w:b/>
+          <w:bCs/>
           <w:lang w:val="sl-SI"/>
         </w:rPr>
         <w:t>Krediti za podjetnike</w:t>
@@ -1382,7 +1386,6 @@
         <w:rPr>
           <w:b/>
           <w:bCs/>
-          <w:color w:val="EE0000"/>
           <w:lang w:val="sl-SI"/>
         </w:rPr>
         <w:t>:</w:t>
@@ -1391,7 +1394,6 @@
         <w:rPr>
           <w:b/>
           <w:bCs/>
-          <w:color w:val="EE0000"/>
           <w:lang w:val="sl-SI"/>
         </w:rPr>
         <w:t xml:space="preserve"> največ dokumentacije, največ tveganja</w:t>
@@ -1401,67 +1403,437 @@
       <w:pPr>
         <w:spacing w:after="0" w:line="240" w:lineRule="auto"/>
         <w:rPr>
-          <w:color w:val="EE0000"/>
-          <w:lang w:val="sl-SI"/>
-        </w:rPr>
-      </w:pPr>
-      <w:r>
-        <w:rPr>
-          <w:color w:val="EE0000"/>
+          <w:lang w:val="sl-SI"/>
+        </w:rPr>
+      </w:pPr>
+      <w:r>
+        <w:rPr>
+          <w:lang w:val="sl-SI"/>
+        </w:rPr>
+        <w:t xml:space="preserve">Krediti za podjetnike ali samostojne podjetnike so posebna kategorija. Banka pri teh kreditih ocenjuje ne samo osebno finančno stanje komitenta, ampak tudi poslovanje podjetja. Prihodki podjetnika so </w:t>
+      </w:r>
+      <w:r>
+        <w:rPr>
+          <w:lang w:val="sl-SI"/>
+        </w:rPr>
+        <w:t xml:space="preserve">namreč </w:t>
+      </w:r>
+      <w:r>
+        <w:rPr>
+          <w:lang w:val="sl-SI"/>
+        </w:rPr>
+        <w:t>lahko zelo nestabilni, kar pomeni večje tveganje za banko.</w:t>
+      </w:r>
+    </w:p>
+    <w:p>
+      <w:pPr>
+        <w:spacing w:after="0" w:line="240" w:lineRule="auto"/>
+        <w:rPr>
+          <w:lang w:val="sl-SI"/>
+        </w:rPr>
+      </w:pPr>
+    </w:p>
+    <w:p>
+      <w:pPr>
+        <w:spacing w:after="0" w:line="240" w:lineRule="auto"/>
+        <w:rPr>
+          <w:lang w:val="sl-SI"/>
+        </w:rPr>
+      </w:pPr>
+      <w:r>
+        <w:rPr>
+          <w:lang w:val="sl-SI"/>
+        </w:rPr>
+        <w:t>Zato so obrestne mere pogosto višje, dokumentacije pa je več</w:t>
+      </w:r>
+      <w:r>
+        <w:rPr>
+          <w:lang w:val="sl-SI"/>
+        </w:rPr>
+        <w:t>, saj b</w:t>
+      </w:r>
+      <w:r>
+        <w:rPr>
+          <w:lang w:val="sl-SI"/>
+        </w:rPr>
+        <w:t xml:space="preserve">anka </w:t>
+      </w:r>
+      <w:r>
+        <w:rPr>
+          <w:lang w:val="sl-SI"/>
+        </w:rPr>
+        <w:t>običajno zahteva</w:t>
+      </w:r>
+      <w:r>
+        <w:rPr>
+          <w:lang w:val="sl-SI"/>
+        </w:rPr>
+        <w:t xml:space="preserve"> bilance, </w:t>
+      </w:r>
+      <w:r>
+        <w:rPr>
+          <w:lang w:val="sl-SI"/>
+        </w:rPr>
+        <w:t xml:space="preserve">razčlenitve bilančnih postavk, </w:t>
+      </w:r>
+      <w:r>
+        <w:rPr>
+          <w:lang w:val="sl-SI"/>
+        </w:rPr>
+        <w:t xml:space="preserve">davčne obračune, poslovni </w:t>
+      </w:r>
+      <w:r>
+        <w:rPr>
+          <w:lang w:val="sl-SI"/>
+        </w:rPr>
+        <w:t xml:space="preserve">in finančni </w:t>
+      </w:r>
+      <w:r>
+        <w:rPr>
+          <w:lang w:val="sl-SI"/>
+        </w:rPr>
+        <w:t xml:space="preserve">načrt, </w:t>
+      </w:r>
+      <w:r>
+        <w:rPr>
+          <w:lang w:val="sl-SI"/>
+        </w:rPr>
+        <w:t xml:space="preserve">denarne tokove, </w:t>
+      </w:r>
+      <w:r>
+        <w:rPr>
+          <w:lang w:val="sl-SI"/>
+        </w:rPr>
+        <w:t xml:space="preserve">pogodbe </w:t>
+      </w:r>
+      <w:r>
+        <w:rPr>
           <w:lang w:val="sl-SI"/>
         </w:rPr>
         <w:lastRenderedPageBreak/>
-        <w:t>Krediti za podjetnike ali samostojne podjetnike so posebna kategorija. Banka pri teh kreditih ocenjuje ne samo osebno finančno stanje komitenta, ampak tudi poslovanje podjetja. Prihodki podjetnika so lahko zelo nestabilni, kar pomeni večje tveganje za banko.</w:t>
-      </w:r>
-    </w:p>
-    <w:p>
-      <w:pPr>
-        <w:spacing w:after="0" w:line="240" w:lineRule="auto"/>
-        <w:rPr>
-          <w:color w:val="EE0000"/>
-          <w:lang w:val="sl-SI"/>
-        </w:rPr>
-      </w:pPr>
-    </w:p>
-    <w:p>
-      <w:pPr>
-        <w:spacing w:after="0" w:line="240" w:lineRule="auto"/>
-        <w:rPr>
-          <w:color w:val="EE0000"/>
-          <w:lang w:val="sl-SI"/>
-        </w:rPr>
-      </w:pPr>
-      <w:r>
-        <w:rPr>
-          <w:color w:val="EE0000"/>
-          <w:lang w:val="sl-SI"/>
-        </w:rPr>
-        <w:t>Zato so obrestne mere pogosto višje, dokumentacije pa je več. Banka lahko zahteva bilance, davčne obračune, poslovni načrt, pogodbe s strankami in celo osebno poroštvo. Doba odplačevanja je običajno krajša kot pri stanovanjskem kreditu, kar pomeni višje mesečne obroke.</w:t>
-      </w:r>
-    </w:p>
-    <w:p>
-      <w:pPr>
-        <w:spacing w:after="0" w:line="240" w:lineRule="auto"/>
-        <w:rPr>
-          <w:color w:val="EE0000"/>
-          <w:lang w:val="sl-SI"/>
-        </w:rPr>
-      </w:pPr>
-    </w:p>
-    <w:p>
-      <w:pPr>
-        <w:spacing w:after="0" w:line="240" w:lineRule="auto"/>
-        <w:rPr>
-          <w:color w:val="EE0000"/>
-          <w:lang w:val="sl-SI"/>
-        </w:rPr>
-      </w:pPr>
-      <w:r>
-        <w:rPr>
-          <w:color w:val="EE0000"/>
-          <w:lang w:val="sl-SI"/>
-        </w:rPr>
-        <w:t>Tak kredit je smiseln, kadar podjetje potrebuje kapital za rast, nakup opreme ali financiranje projektov, ki bodo prinesli prihodke. A podjetnik mora biti pripravljen na strožjo presojo in višje stroške.</w:t>
+        <w:t xml:space="preserve">s strankami in </w:t>
+      </w:r>
+      <w:r>
+        <w:rPr>
+          <w:lang w:val="sl-SI"/>
+        </w:rPr>
+        <w:t xml:space="preserve">planski načrt, za zavarovanje pa se pogosto zahteva tudi </w:t>
+      </w:r>
+      <w:r>
+        <w:rPr>
+          <w:lang w:val="sl-SI"/>
+        </w:rPr>
+        <w:t>osebno poroštvo. Doba odplačevanja je običajno krajša kot pri stanovanjskem kreditu, kar pomeni višje mesečne obroke.</w:t>
+      </w:r>
+    </w:p>
+    <w:p>
+      <w:pPr>
+        <w:spacing w:after="0" w:line="240" w:lineRule="auto"/>
+        <w:rPr>
+          <w:lang w:val="sl-SI"/>
+        </w:rPr>
+      </w:pPr>
+    </w:p>
+    <w:p>
+      <w:pPr>
+        <w:spacing w:after="0" w:line="240" w:lineRule="auto"/>
+        <w:rPr>
+          <w:lang w:val="sl-SI"/>
+        </w:rPr>
+      </w:pPr>
+      <w:r>
+        <w:rPr>
+          <w:lang w:val="sl-SI"/>
+        </w:rPr>
+        <w:t>Tak kredit je smiseln, kadar podjetje potrebuje kapital za rast,</w:t>
+      </w:r>
+      <w:r>
+        <w:rPr>
+          <w:lang w:val="sl-SI"/>
+        </w:rPr>
+        <w:t xml:space="preserve"> finančciranje obratnega kapitala,</w:t>
+      </w:r>
+      <w:r>
+        <w:rPr>
+          <w:lang w:val="sl-SI"/>
+        </w:rPr>
+        <w:t xml:space="preserve"> nakup opreme ali financiranje projektov, ki bodo prinesli prihodke. A podjetnik mora biti pripravljen na strožjo presojo in višje stroške.</w:t>
+      </w:r>
+      <w:r>
+        <w:rPr>
+          <w:lang w:val="sl-SI"/>
+        </w:rPr>
+        <w:t xml:space="preserve"> </w:t>
+      </w:r>
+    </w:p>
+    <w:p>
+      <w:pPr>
+        <w:spacing w:after="0" w:line="240" w:lineRule="auto"/>
+        <w:rPr>
+          <w:lang w:val="sl-SI"/>
+        </w:rPr>
+      </w:pPr>
+    </w:p>
+    <w:p>
+      <w:pPr>
+        <w:spacing w:after="0" w:line="240" w:lineRule="auto"/>
+        <w:rPr>
+          <w:b/>
+          <w:bCs/>
+          <w:lang w:val="sl-SI"/>
+        </w:rPr>
+      </w:pPr>
+      <w:r>
+        <w:rPr>
+          <w:b/>
+          <w:bCs/>
+          <w:lang w:val="sl-SI"/>
+        </w:rPr>
+        <w:t>Faktoring: ko podjetje proda terjatve za hitrejši denarni tok</w:t>
+      </w:r>
+    </w:p>
+    <w:p>
+      <w:pPr>
+        <w:spacing w:after="0" w:line="240" w:lineRule="auto"/>
+        <w:rPr>
+          <w:lang w:val="sl-SI"/>
+        </w:rPr>
+      </w:pPr>
+      <w:r>
+        <w:rPr>
+          <w:lang w:val="sl-SI"/>
+        </w:rPr>
+        <w:t>Faktoring ni kredit, ampak posebna oblika financiranja, ki podjet</w:t>
+      </w:r>
+      <w:r>
+        <w:rPr>
+          <w:lang w:val="sl-SI"/>
+        </w:rPr>
+        <w:t>niku</w:t>
+      </w:r>
+      <w:r>
+        <w:rPr>
+          <w:lang w:val="sl-SI"/>
+        </w:rPr>
+        <w:t xml:space="preserve"> omogoča takojšen dostop do denarja, vezanega v izdanih računih. Namesto da podjet</w:t>
+      </w:r>
+      <w:r>
+        <w:rPr>
+          <w:lang w:val="sl-SI"/>
+        </w:rPr>
+        <w:t>nik</w:t>
+      </w:r>
+      <w:r>
+        <w:rPr>
+          <w:lang w:val="sl-SI"/>
+        </w:rPr>
+        <w:t xml:space="preserve"> čaka 30, 60 ali 90 dni, da kupec poravna obveznost, terjatev proda faktoring hiši ali banki, ki mu večino zneska izplača takoj</w:t>
+      </w:r>
+      <w:r>
+        <w:rPr>
+          <w:lang w:val="sl-SI"/>
+        </w:rPr>
+        <w:t>, p</w:t>
+      </w:r>
+      <w:r>
+        <w:rPr>
+          <w:lang w:val="sl-SI"/>
+        </w:rPr>
+        <w:t xml:space="preserve">reostanek </w:t>
+      </w:r>
+      <w:r>
+        <w:rPr>
+          <w:lang w:val="sl-SI"/>
+        </w:rPr>
+        <w:t xml:space="preserve">pa </w:t>
+      </w:r>
+      <w:r>
+        <w:rPr>
+          <w:lang w:val="sl-SI"/>
+        </w:rPr>
+        <w:t>podjet</w:t>
+      </w:r>
+      <w:r>
+        <w:rPr>
+          <w:lang w:val="sl-SI"/>
+        </w:rPr>
+        <w:t>nik</w:t>
+      </w:r>
+      <w:r>
+        <w:rPr>
+          <w:lang w:val="sl-SI"/>
+        </w:rPr>
+        <w:t xml:space="preserve"> prejme, ko </w:t>
+      </w:r>
+      <w:r>
+        <w:rPr>
+          <w:lang w:val="sl-SI"/>
+        </w:rPr>
+        <w:t xml:space="preserve">njegov </w:t>
+      </w:r>
+      <w:r>
+        <w:rPr>
+          <w:lang w:val="sl-SI"/>
+        </w:rPr>
+        <w:t>kupec dejansko poravna</w:t>
+      </w:r>
+      <w:r>
+        <w:rPr>
+          <w:lang w:val="sl-SI"/>
+        </w:rPr>
+        <w:t xml:space="preserve"> </w:t>
+      </w:r>
+      <w:r>
+        <w:rPr>
+          <w:lang w:val="sl-SI"/>
+        </w:rPr>
+        <w:t>račun.</w:t>
+      </w:r>
+    </w:p>
+    <w:p>
+      <w:pPr>
+        <w:spacing w:after="0" w:line="240" w:lineRule="auto"/>
+        <w:rPr>
+          <w:lang w:val="sl-SI"/>
+        </w:rPr>
+      </w:pPr>
+    </w:p>
+    <w:p>
+      <w:pPr>
+        <w:spacing w:after="0" w:line="240" w:lineRule="auto"/>
+        <w:rPr>
+          <w:lang w:val="sl-SI"/>
+        </w:rPr>
+      </w:pPr>
+      <w:r>
+        <w:rPr>
+          <w:lang w:val="sl-SI"/>
+        </w:rPr>
+        <w:t>G</w:t>
+      </w:r>
+      <w:r>
+        <w:rPr>
+          <w:lang w:val="sl-SI"/>
+        </w:rPr>
+        <w:t xml:space="preserve">lavna prednost faktoringa </w:t>
+      </w:r>
+      <w:r>
+        <w:rPr>
+          <w:lang w:val="sl-SI"/>
+        </w:rPr>
+        <w:t>z</w:t>
+      </w:r>
+      <w:r>
+        <w:rPr>
+          <w:lang w:val="sl-SI"/>
+        </w:rPr>
+        <w:t>a podjet</w:t>
+      </w:r>
+      <w:r>
+        <w:rPr>
+          <w:lang w:val="sl-SI"/>
+        </w:rPr>
+        <w:t xml:space="preserve">nika </w:t>
+      </w:r>
+      <w:r>
+        <w:rPr>
+          <w:lang w:val="sl-SI"/>
+        </w:rPr>
+        <w:t xml:space="preserve">je </w:t>
+      </w:r>
+      <w:r>
+        <w:rPr>
+          <w:lang w:val="sl-SI"/>
+        </w:rPr>
+        <w:t>promptno</w:t>
+      </w:r>
+      <w:r>
+        <w:rPr>
+          <w:lang w:val="sl-SI"/>
+        </w:rPr>
+        <w:t xml:space="preserve"> izboljšan denarni tok</w:t>
+      </w:r>
+      <w:r>
+        <w:rPr>
+          <w:lang w:val="sl-SI"/>
+        </w:rPr>
+        <w:t>, saj mu n</w:t>
+      </w:r>
+      <w:r>
+        <w:rPr>
+          <w:lang w:val="sl-SI"/>
+        </w:rPr>
+        <w:t xml:space="preserve">i treba čakati na plačila, zato lažje financira obratni kapital, plačuje dobavitelje, izplačuje plače ali investira v rast. Ker je zavarovanje posla pravzaprav sama terjatev, je tveganje za </w:t>
+      </w:r>
+      <w:r>
+        <w:rPr>
+          <w:lang w:val="sl-SI"/>
+        </w:rPr>
+        <w:t xml:space="preserve">faktoring hušo ali </w:t>
+      </w:r>
+      <w:r>
+        <w:rPr>
+          <w:lang w:val="sl-SI"/>
+        </w:rPr>
+        <w:t>banko nižje kot pri klasičnem podjetniškem kreditu</w:t>
+      </w:r>
+      <w:r>
+        <w:rPr>
+          <w:lang w:val="sl-SI"/>
+        </w:rPr>
+        <w:t xml:space="preserve">, </w:t>
+      </w:r>
+      <w:r>
+        <w:rPr>
+          <w:lang w:val="sl-SI"/>
+        </w:rPr>
+        <w:t xml:space="preserve">postopek </w:t>
+      </w:r>
+      <w:r>
+        <w:rPr>
+          <w:lang w:val="sl-SI"/>
+        </w:rPr>
+        <w:t xml:space="preserve">je </w:t>
+      </w:r>
+      <w:r>
+        <w:rPr>
+          <w:lang w:val="sl-SI"/>
+        </w:rPr>
+        <w:t xml:space="preserve">hitrejši, dokumentacije pa </w:t>
+      </w:r>
+      <w:r>
+        <w:rPr>
+          <w:lang w:val="sl-SI"/>
+        </w:rPr>
+        <w:t xml:space="preserve">je </w:t>
+      </w:r>
+      <w:r>
+        <w:rPr>
+          <w:lang w:val="sl-SI"/>
+        </w:rPr>
+        <w:t>manj.</w:t>
+      </w:r>
+    </w:p>
+    <w:p>
+      <w:pPr>
+        <w:spacing w:after="0" w:line="240" w:lineRule="auto"/>
+        <w:rPr>
+          <w:lang w:val="sl-SI"/>
+        </w:rPr>
+      </w:pPr>
+    </w:p>
+    <w:p>
+      <w:pPr>
+        <w:spacing w:after="0" w:line="240" w:lineRule="auto"/>
+        <w:rPr>
+          <w:lang w:val="sl-SI"/>
+        </w:rPr>
+      </w:pPr>
+      <w:r>
+        <w:rPr>
+          <w:lang w:val="sl-SI"/>
+        </w:rPr>
+        <w:t>Poznamo regresni in neregresni faktoring. Pri regresnem podjetnik jamči za neplačilo kupca, pri neregresnem pa tveganje neplačila prevzame faktoring hiša oziroma banka. Posledično je ta oblika financiranja dražja, a za podjetnika tudi varnejša. Prednost faktoringa je tudi v tem, da ima ta oblika financiranja izrazito pozitiven vpliv na bilančno strukturo, denarni tok in upravljanje obratnih sredstev, kar posredno izboljšuje tudi kreditno sposobnost podjetnika.</w:t>
       </w:r>
     </w:p>
     <w:p>
@@ -1869,7 +2241,14 @@
         <w:rPr>
           <w:lang w:val="sl-SI"/>
         </w:rPr>
-        <w:t>. Obrestna mera sama po sebi ne pove celotne zgodbe. EOM vključuje vse stroške kredita in pokaže, koliko kredit v resnici stane. Dve banki lahko imata enako obrestno mero, a zelo različno EOM, če ima ena višje stroške odobritve ali zavarovanja.</w:t>
+        <w:t xml:space="preserve">. Obrestna mera sama po sebi ne pove celotne zgodbe. EOM vključuje vse stroške kredita in pokaže, koliko kredit v resnici stane. Dve banki </w:t>
+      </w:r>
+      <w:r>
+        <w:rPr>
+          <w:lang w:val="sl-SI"/>
+        </w:rPr>
+        <w:lastRenderedPageBreak/>
+        <w:t>lahko imata enako obrestno mero, a zelo različno EOM, če ima ena višje stroške odobritve ali zavarovanja.</w:t>
       </w:r>
     </w:p>
     <w:p>
@@ -2001,7 +2380,6 @@
         <w:rPr>
           <w:lang w:val="sl-SI"/>
         </w:rPr>
-        <w:lastRenderedPageBreak/>
         <w:t xml:space="preserve">FinPortal.si je ustvarjen prav zato, da ti pomaga razumeti te razlike. Ko razumeš, kako banke razmišljajo, postaneš močnejši pogajalec in bolj samozavesten komitent. In to je </w:t>
       </w:r>
       <w:r>

</xml_diff>

<commit_message>
nov članek + csv
</commit_message>
<xml_diff>
--- a/clanki/VRSTE KREDITOV IN ZAKAJ IMAJO RAZLIČNE OBRESTNE MERE.docx
+++ b/clanki/VRSTE KREDITOV IN ZAKAJ IMAJO RAZLIČNE OBRESTNE MERE.docx
@@ -5,6 +5,7 @@
     <w:p>
       <w:pPr>
         <w:spacing w:after="0" w:line="240" w:lineRule="auto"/>
+        <w:jc w:val="center"/>
         <w:rPr>
           <w:b/>
           <w:bCs/>
@@ -1772,48 +1773,61 @@
           <w:lang w:val="sl-SI"/>
         </w:rPr>
       </w:pPr>
-      <w:r>
-        <w:rPr>
-          <w:b/>
-          <w:bCs/>
-          <w:lang w:val="sl-SI"/>
-        </w:rPr>
-        <w:t>Vrste kreditov in zakaj imajo različne obrestne mere</w:t>
-      </w:r>
-    </w:p>
-    <w:p>
-      <w:pPr>
-        <w:spacing w:after="0" w:line="240" w:lineRule="auto"/>
-        <w:rPr>
-          <w:lang w:val="sl-SI"/>
-        </w:rPr>
-      </w:pPr>
-    </w:p>
-    <w:p>
-      <w:pPr>
-        <w:spacing w:after="0" w:line="240" w:lineRule="auto"/>
-        <w:rPr>
-          <w:b/>
-          <w:bCs/>
-          <w:lang w:val="sl-SI"/>
-        </w:rPr>
-      </w:pPr>
-      <w:r>
-        <w:rPr>
-          <w:rFonts w:ascii="Segoe UI Emoji" w:hAnsi="Segoe UI Emoji" w:cs="Segoe UI Emoji"/>
-          <w:b/>
-          <w:bCs/>
-          <w:lang w:val="sl-SI"/>
-        </w:rPr>
-        <w:t>🔵</w:t>
-      </w:r>
-      <w:r>
-        <w:rPr>
-          <w:b/>
-          <w:bCs/>
-          <w:lang w:val="sl-SI"/>
-        </w:rPr>
-        <w:t xml:space="preserve"> META TITLE (60 znakov)</w:t>
+    </w:p>
+    <w:p>
+      <w:pPr>
+        <w:spacing w:after="0" w:line="240" w:lineRule="auto"/>
+        <w:rPr>
+          <w:b/>
+          <w:bCs/>
+          <w:lang w:val="sl-SI"/>
+        </w:rPr>
+      </w:pPr>
+    </w:p>
+    <w:p>
+      <w:pPr>
+        <w:spacing w:after="0" w:line="240" w:lineRule="auto"/>
+        <w:rPr>
+          <w:b/>
+          <w:bCs/>
+          <w:lang w:val="sl-SI"/>
+        </w:rPr>
+      </w:pPr>
+    </w:p>
+    <w:p>
+      <w:pPr>
+        <w:spacing w:after="0" w:line="240" w:lineRule="auto"/>
+        <w:rPr>
+          <w:b/>
+          <w:bCs/>
+          <w:lang w:val="sl-SI"/>
+        </w:rPr>
+      </w:pPr>
+    </w:p>
+    <w:p>
+      <w:pPr>
+        <w:spacing w:after="0" w:line="240" w:lineRule="auto"/>
+        <w:rPr>
+          <w:lang w:val="sl-SI"/>
+        </w:rPr>
+      </w:pPr>
+    </w:p>
+    <w:p>
+      <w:pPr>
+        <w:spacing w:after="0" w:line="240" w:lineRule="auto"/>
+        <w:rPr>
+          <w:b/>
+          <w:bCs/>
+          <w:lang w:val="sl-SI"/>
+        </w:rPr>
+      </w:pPr>
+      <w:r>
+        <w:rPr>
+          <w:b/>
+          <w:bCs/>
+          <w:lang w:val="sl-SI"/>
+        </w:rPr>
+        <w:t>META TITLE</w:t>
       </w:r>
     </w:p>
     <w:p>
@@ -1849,20 +1863,11 @@
       </w:pPr>
       <w:r>
         <w:rPr>
-          <w:rFonts w:ascii="Segoe UI Emoji" w:hAnsi="Segoe UI Emoji" w:cs="Segoe UI Emoji"/>
-          <w:b/>
-          <w:bCs/>
-          <w:lang w:val="sl-SI"/>
-        </w:rPr>
-        <w:t>🔵</w:t>
-      </w:r>
-      <w:r>
-        <w:rPr>
-          <w:b/>
-          <w:bCs/>
-          <w:lang w:val="sl-SI"/>
-        </w:rPr>
-        <w:t xml:space="preserve"> META DESCRIPTION (155–160 znakov)</w:t>
+          <w:b/>
+          <w:bCs/>
+          <w:lang w:val="sl-SI"/>
+        </w:rPr>
+        <w:t>META DESCRIPTION</w:t>
       </w:r>
     </w:p>
     <w:p>
@@ -1898,20 +1903,11 @@
       </w:pPr>
       <w:r>
         <w:rPr>
-          <w:rFonts w:ascii="Segoe UI Emoji" w:hAnsi="Segoe UI Emoji" w:cs="Segoe UI Emoji"/>
-          <w:b/>
-          <w:bCs/>
-          <w:lang w:val="sl-SI"/>
-        </w:rPr>
-        <w:t>🔵</w:t>
-      </w:r>
-      <w:r>
-        <w:rPr>
-          <w:b/>
-          <w:bCs/>
-          <w:lang w:val="sl-SI"/>
-        </w:rPr>
-        <w:t xml:space="preserve"> SEO POVZETEK (za začetek članka ali schema description)</w:t>
+          <w:b/>
+          <w:bCs/>
+          <w:lang w:val="sl-SI"/>
+        </w:rPr>
+        <w:t>SEO POVZETEK</w:t>
       </w:r>
     </w:p>
     <w:p>

</xml_diff>